<commit_message>
Kód befejezése Állapot: Tesztelésre vár
</commit_message>
<xml_diff>
--- a/OkostoltoRendszer/Documents/Specifikáció.docx
+++ b/OkostoltoRendszer/Documents/Specifikáció.docx
@@ -860,8 +860,18 @@
           <w:sz w:val="28"/>
           <w:szCs w:val="40"/>
         </w:rPr>
-        <w:t>A nap végén jelenítse meg a portok kihasználtságát %-ban és a teljes bevételt egy file-ban</w:t>
-      </w:r>
+        <w:t>A nap végén jelenítse meg a portok kihasználtságát %-ban és a teljes bevételt</w:t>
+      </w:r>
+      <w:r>
+        <w:rPr>
+          <w:rFonts w:eastAsia="Yu Gothic UI Semibold" w:cstheme="minorHAnsi"/>
+          <w:sz w:val="28"/>
+          <w:szCs w:val="40"/>
+        </w:rPr>
+        <w:t>.</w:t>
+      </w:r>
+      <w:bookmarkStart w:id="0" w:name="_GoBack"/>
+      <w:bookmarkEnd w:id="0"/>
     </w:p>
     <w:p>
       <w:pPr>
@@ -1291,17 +1301,7 @@
           <w:sz w:val="28"/>
           <w:szCs w:val="40"/>
         </w:rPr>
-        <w:t>Tesla, Hyunda</w:t>
-      </w:r>
-      <w:bookmarkStart w:id="0" w:name="_GoBack"/>
-      <w:bookmarkEnd w:id="0"/>
-      <w:r>
-        <w:rPr>
-          <w:rFonts w:eastAsia="Yu Gothic UI Semibold" w:cstheme="minorHAnsi"/>
-          <w:sz w:val="28"/>
-          <w:szCs w:val="40"/>
-        </w:rPr>
-        <w:t>i, Volkswagen</w:t>
+        <w:t>Tesla, Hyundai, Volkswagen</w:t>
       </w:r>
     </w:p>
     <w:p>
@@ -1479,16 +1479,7 @@
                 <w:sz w:val="32"/>
                 <w:szCs w:val="40"/>
               </w:rPr>
-              <w:t>Gyors port</w:t>
-            </w:r>
-            <w:r>
-              <w:rPr>
-                <w:rFonts w:eastAsia="Yu Gothic UI Semibold" w:cstheme="minorHAnsi"/>
-                <w:b/>
-                <w:sz w:val="32"/>
-                <w:szCs w:val="40"/>
-              </w:rPr>
-              <w:t xml:space="preserve"> (2db)</w:t>
+              <w:t>Gyors port (2db)</w:t>
             </w:r>
           </w:p>
         </w:tc>
@@ -3306,7 +3297,7 @@
 </file>
 
 <file path=customXml/itemProps1.xml><?xml version="1.0" encoding="utf-8"?>
-<ds:datastoreItem xmlns:ds="http://schemas.openxmlformats.org/officeDocument/2006/customXml" ds:itemID="{2C3C45A0-8A35-4F1C-B1BC-02A82AE79BEF}">
+<ds:datastoreItem xmlns:ds="http://schemas.openxmlformats.org/officeDocument/2006/customXml" ds:itemID="{E6D332EE-68C1-4E7B-B1EE-5627D472E659}">
   <ds:schemaRefs>
     <ds:schemaRef ds:uri="http://schemas.openxmlformats.org/officeDocument/2006/bibliography"/>
   </ds:schemaRefs>

</xml_diff>